<commit_message>
Add HIPAA readiness playbook (PB-11)
</commit_message>
<xml_diff>
--- a/kit/cross/pb-01-how-to-use-this-kit.docx
+++ b/kit/cross/pb-01-how-to-use-this-kit.docx
@@ -681,7 +681,7 @@
           <w:b w:val="0"/>
           <w:i w:val="0"/>
         </w:rPr>
-        <w:t xml:space="preserve"> If you are heading for ISO/IEC 27001, start with PB-02. For SOC 2, start with PB-03. For GDPR, start with PB-04. To add privacy management to an existing information security management system, use PB-05. You can run more than one; PB-10 explains how the frameworks share one control set.</w:t>
+        <w:t xml:space="preserve"> If you are heading for ISO/IEC 27001, start with PB-02. For SOC 2, start with PB-03. For GDPR, start with PB-04. To add privacy management to an existing information security management system, use PB-05. For United States health data, use PB-11. You can run more than one; PB-10 explains how the frameworks share one control set.</w:t>
       </w:r>
     </w:p>
     <w:p>
@@ -962,6 +962,18 @@
           <w:i w:val="0"/>
         </w:rPr>
         <w:t>PB-10 Combining frameworks</w:t>
+      </w:r>
+    </w:p>
+    <w:p>
+      <w:pPr>
+        <w:pStyle w:val="ListBullet"/>
+      </w:pPr>
+      <w:r>
+        <w:rPr>
+          <w:b w:val="0"/>
+          <w:i w:val="0"/>
+        </w:rPr>
+        <w:t>PB-11 HIPAA readiness</w:t>
       </w:r>
     </w:p>
     <w:p/>

</xml_diff>